<commit_message>
Add NKUA / MSc DSIT affiliation and supervisor to report, slides and README
Co-Authored-By: Claude Opus 4.8 <noreply@anthropic.com>
</commit_message>
<xml_diff>
--- a/report/MLCB_report.docx
+++ b/report/MLCB_report.docx
@@ -31,7 +31,19 @@
         <w:pStyle w:val="Date"/>
       </w:pPr>
       <w:r>
-        <w:t xml:space="preserve">MLCB Team Project — Re-analysis of Maitra et al. (2023), Nature Communications 14, 2912 — June 2026</w:t>
+        <w:t xml:space="preserve">National and Kapodistrian University of Athens (NKUA) — MSc in Data Science and Information Technologies</w:t>
+      </w:r>
+      <w:r>
+        <w:br/>
+      </w:r>
+      <w:r>
+        <w:t xml:space="preserve">MLCB Team Project — Supervisor: Prof. E. Manolakos</w:t>
+      </w:r>
+      <w:r>
+        <w:br/>
+      </w:r>
+      <w:r>
+        <w:t xml:space="preserve">Re-analysis of Maitra et al. (2023), Nature Communications 14, 2912 — June 2026</w:t>
       </w:r>
     </w:p>
     <w:p>

</xml_diff>

<commit_message>
Cite the GitLab repository as the code link (GitHub kept as mirror)
Co-Authored-By: Claude Opus 4.8 <noreply@anthropic.com>
</commit_message>
<xml_diff>
--- a/report/MLCB_report.docx
+++ b/report/MLCB_report.docx
@@ -8614,7 +8614,7 @@
       </w:r>
     </w:p>
     <w:bookmarkEnd w:id="61"/>
-    <w:bookmarkStart w:id="66" w:name="data-and-code-availability"/>
+    <w:bookmarkStart w:id="67" w:name="data-and-code-availability"/>
     <w:p>
       <w:pPr>
         <w:pStyle w:val="Heading1"/>
@@ -8710,7 +8710,7 @@
       </w:r>
     </w:p>
     <w:bookmarkEnd w:id="62"/>
-    <w:bookmarkStart w:id="64" w:name="code."/>
+    <w:bookmarkStart w:id="65" w:name="code."/>
     <w:p>
       <w:pPr>
         <w:pStyle w:val="Heading4"/>
@@ -8730,6 +8730,23 @@
         <w:br/>
       </w:r>
       <w:hyperlink r:id="rId63">
+        <w:r>
+          <w:rPr>
+            <w:rStyle w:val="Hyperlink"/>
+          </w:rPr>
+          <w:t xml:space="preserve">https://gitlab.com/boulgeo/MLCB_team_project</w:t>
+        </w:r>
+      </w:hyperlink>
+      <w:r>
+        <w:br/>
+      </w:r>
+      <w:r>
+        <w:t xml:space="preserve">(mirrored at</w:t>
+      </w:r>
+      <w:r>
+        <w:t xml:space="preserve"> </w:t>
+      </w:r>
+      <w:hyperlink r:id="rId64">
         <w:r>
           <w:rPr>
             <w:rStyle w:val="Hyperlink"/>
@@ -8738,7 +8755,10 @@
         </w:r>
       </w:hyperlink>
       <w:r>
-        <w:br/>
+        <w:t xml:space="preserve">),</w:t>
+      </w:r>
+      <w:r>
+        <w:t xml:space="preserve"> </w:t>
       </w:r>
       <w:r>
         <w:t xml:space="preserve">organised as</w:t>
@@ -8963,8 +8983,8 @@
         <w:t xml:space="preserve">are regenerated from GEO by the Phase A notebook.</w:t>
       </w:r>
     </w:p>
-    <w:bookmarkEnd w:id="64"/>
-    <w:bookmarkStart w:id="65" w:name="reproducibility-settings."/>
+    <w:bookmarkEnd w:id="65"/>
+    <w:bookmarkStart w:id="66" w:name="reproducibility-settings."/>
     <w:p>
       <w:pPr>
         <w:pStyle w:val="Heading4"/>
@@ -9021,9 +9041,9 @@
         <w:t xml:space="preserve">step is checkpointed, so a runtime timeout never costs more than one step.</w:t>
       </w:r>
     </w:p>
-    <w:bookmarkEnd w:id="65"/>
     <w:bookmarkEnd w:id="66"/>
-    <w:bookmarkStart w:id="67" w:name="author-contributions"/>
+    <w:bookmarkEnd w:id="67"/>
+    <w:bookmarkStart w:id="68" w:name="author-contributions"/>
     <w:p>
       <w:pPr>
         <w:pStyle w:val="Heading1"/>
@@ -9216,8 +9236,8 @@
         <w:t xml:space="preserve">approved the final version.</w:t>
       </w:r>
     </w:p>
-    <w:bookmarkEnd w:id="67"/>
-    <w:bookmarkStart w:id="68" w:name="ai-usage-disclosure"/>
+    <w:bookmarkEnd w:id="68"/>
+    <w:bookmarkStart w:id="69" w:name="ai-usage-disclosure"/>
     <w:p>
       <w:pPr>
         <w:pStyle w:val="Heading1"/>
@@ -9446,8 +9466,8 @@
         <w:t xml:space="preserve">work.</w:t>
       </w:r>
     </w:p>
-    <w:bookmarkEnd w:id="68"/>
-    <w:bookmarkStart w:id="69" w:name="competing-interests"/>
+    <w:bookmarkEnd w:id="69"/>
+    <w:bookmarkStart w:id="70" w:name="competing-interests"/>
     <w:p>
       <w:pPr>
         <w:pStyle w:val="Heading1"/>
@@ -9464,8 +9484,8 @@
         <w:t xml:space="preserve">The authors declare no competing interests.</w:t>
       </w:r>
     </w:p>
-    <w:bookmarkEnd w:id="69"/>
-    <w:bookmarkStart w:id="70" w:name="references"/>
+    <w:bookmarkEnd w:id="70"/>
+    <w:bookmarkStart w:id="71" w:name="references"/>
     <w:p>
       <w:pPr>
         <w:pStyle w:val="Heading1"/>
@@ -9949,7 +9969,7 @@
         <w:t xml:space="preserve">, 2623–2631 (2019).</w:t>
       </w:r>
     </w:p>
-    <w:bookmarkEnd w:id="70"/>
+    <w:bookmarkEnd w:id="71"/>
     <w:sectPr>
       <w:footnotePr>
         <w:numRestart w:val="eachSect"/>

</xml_diff>